<commit_message>
work on april 5
</commit_message>
<xml_diff>
--- a/updates.docx
+++ b/updates.docx
@@ -27,15 +27,7 @@
         </w:numPr>
       </w:pPr>
       <w:r>
-        <w:t>Check out UCSD CS professor Yi-</w:t>
-      </w:r>
-      <w:proofErr w:type="gramStart"/>
-      <w:r>
-        <w:t>an</w:t>
-      </w:r>
-      <w:proofErr w:type="gramEnd"/>
-      <w:r>
-        <w:t xml:space="preserve"> Ma for web scraping without web scraping + Paul Brothers in Bruno Business Library to ask about using UA libraries for scraping </w:t>
+        <w:t xml:space="preserve">Check out UCSD CS professor Yi-an Ma for web scraping without web scraping + Paul Brothers in Bruno Business Library to ask about using UA libraries for scraping </w:t>
       </w:r>
     </w:p>
     <w:p>
@@ -107,19 +99,11 @@
         <w:t xml:space="preserve">UA Libraries does not have the kind of API that we are thinking of right now. We could still manually search for articles about each climate disaster using the UA Libraries </w:t>
       </w:r>
       <w:hyperlink r:id="rId5" w:history="1">
-        <w:proofErr w:type="spellStart"/>
         <w:r>
           <w:rPr>
             <w:rStyle w:val="Hyperlink"/>
           </w:rPr>
-          <w:t>Faktiva</w:t>
-        </w:r>
-        <w:proofErr w:type="spellEnd"/>
-        <w:r>
-          <w:rPr>
-            <w:rStyle w:val="Hyperlink"/>
-          </w:rPr>
-          <w:t xml:space="preserve"> database</w:t>
+          <w:t>Faktiva database</w:t>
         </w:r>
       </w:hyperlink>
     </w:p>
@@ -173,7 +157,6 @@
         <w:t xml:space="preserve">We can also use this </w:t>
       </w:r>
       <w:hyperlink r:id="rId7" w:anchor="search" w:history="1">
-        <w:proofErr w:type="spellStart"/>
         <w:r>
           <w:rPr>
             <w:rStyle w:val="Hyperlink"/>
@@ -186,7 +169,6 @@
           </w:rPr>
           <w:t>PI</w:t>
         </w:r>
-        <w:proofErr w:type="spellEnd"/>
       </w:hyperlink>
       <w:r>
         <w:t>, which claims to include over 150,000 news articles over the last 5 years. I will try not to use this for now because if it only goes through the past 5 years, then it misses news articles from the 2010s and previously.</w:t>
@@ -259,15 +241,7 @@
       </w:r>
       <w:r>
         <w:lastRenderedPageBreak/>
-        <w:t xml:space="preserve">believe that will make it easier just to test the program and to categorize my sources. I can expand the search later if needed. I did not enable Image search or </w:t>
-      </w:r>
-      <w:proofErr w:type="spellStart"/>
-      <w:r>
-        <w:t>SafeSearch</w:t>
-      </w:r>
-      <w:proofErr w:type="spellEnd"/>
-      <w:r>
-        <w:t xml:space="preserve"> for my </w:t>
+        <w:t xml:space="preserve">believe that will make it easier just to test the program and to categorize my sources. I can expand the search later if needed. I did not enable Image search or SafeSearch for my </w:t>
       </w:r>
       <w:r>
         <w:t>search engine.</w:t>
@@ -282,15 +256,7 @@
         </w:numPr>
       </w:pPr>
       <w:r>
-        <w:t xml:space="preserve">I can access my Google project (API, credentials, settings, </w:t>
-      </w:r>
-      <w:proofErr w:type="spellStart"/>
-      <w:r>
-        <w:t>etc</w:t>
-      </w:r>
-      <w:proofErr w:type="spellEnd"/>
-      <w:r>
-        <w:t xml:space="preserve">) </w:t>
+        <w:t xml:space="preserve">I can access my Google project (API, credentials, settings, etc) </w:t>
       </w:r>
       <w:hyperlink r:id="rId10" w:history="1">
         <w:r>
@@ -561,15 +527,7 @@
         <w:t xml:space="preserve"> so that I can do more than 100 search queries per day</w:t>
       </w:r>
       <w:r>
-        <w:t>. Connected the billing account with the “</w:t>
-      </w:r>
-      <w:proofErr w:type="spellStart"/>
-      <w:r>
-        <w:t>ClimateDisasterResearch</w:t>
-      </w:r>
-      <w:proofErr w:type="spellEnd"/>
-      <w:r>
-        <w:t>” Google Cloud Project. Comes with free $300 credits that expire on March 8, 2026</w:t>
+        <w:t>. Connected the billing account with the “ClimateDisasterResearch” Google Cloud Project. Comes with free $300 credits that expire on March 8, 2026</w:t>
       </w:r>
     </w:p>
     <w:p>
@@ -677,6 +635,221 @@
       </w:hyperlink>
       <w:r>
         <w:t xml:space="preserve"> to continue finding the links later</w:t>
+      </w:r>
+    </w:p>
+    <w:p>
+      <w:r>
+        <w:rPr>
+          <w:b/>
+          <w:bCs/>
+        </w:rPr>
+        <w:t xml:space="preserve">Meeting on April </w:t>
+      </w:r>
+      <w:r>
+        <w:rPr>
+          <w:b/>
+          <w:bCs/>
+        </w:rPr>
+        <w:t>1</w:t>
+      </w:r>
+    </w:p>
+    <w:p>
+      <w:pPr>
+        <w:pStyle w:val="ListParagraph"/>
+        <w:numPr>
+          <w:ilvl w:val="0"/>
+          <w:numId w:val="1"/>
+        </w:numPr>
+      </w:pPr>
+      <w:r>
+        <w:t xml:space="preserve">Dr. Price wants me to get the links for all state and national </w:t>
+      </w:r>
+      <w:r>
+        <w:t>newspapers and</w:t>
+      </w:r>
+      <w:r>
+        <w:t xml:space="preserve"> then </w:t>
+      </w:r>
+      <w:r>
+        <w:t xml:space="preserve">build and </w:t>
+      </w:r>
+      <w:r>
+        <w:t xml:space="preserve">run the Programmable Search Engine API on each </w:t>
+      </w:r>
+      <w:r>
+        <w:t>climate disaster</w:t>
+      </w:r>
+      <w:r>
+        <w:t>. Then, when we have a bunch of the news articles saved, run it with a good prompt into an LLM to develop some kind of index to quantify how each climate disaster is communicated</w:t>
+      </w:r>
+    </w:p>
+    <w:p>
+      <w:pPr>
+        <w:pStyle w:val="ListParagraph"/>
+        <w:numPr>
+          <w:ilvl w:val="0"/>
+          <w:numId w:val="1"/>
+        </w:numPr>
+      </w:pPr>
+      <w:r>
+        <w:t>Send him updates by Monday EOD if possible and then set up next meeting</w:t>
+      </w:r>
+    </w:p>
+    <w:p>
+      <w:pPr>
+        <w:rPr>
+          <w:b/>
+          <w:bCs/>
+        </w:rPr>
+      </w:pPr>
+      <w:r>
+        <w:rPr>
+          <w:b/>
+          <w:bCs/>
+        </w:rPr>
+        <w:t>Work on April 4</w:t>
+      </w:r>
+    </w:p>
+    <w:p>
+      <w:pPr>
+        <w:pStyle w:val="ListParagraph"/>
+        <w:numPr>
+          <w:ilvl w:val="0"/>
+          <w:numId w:val="1"/>
+        </w:numPr>
+      </w:pPr>
+      <w:r>
+        <w:t>Tried traditional search engine web scraping algorithm to find all the links, but that was not successful. Instead, I used a new script that uses the Perplexity API to find each newspaper that exists wherever possible</w:t>
+      </w:r>
+    </w:p>
+    <w:p>
+      <w:pPr>
+        <w:pStyle w:val="ListParagraph"/>
+        <w:numPr>
+          <w:ilvl w:val="1"/>
+          <w:numId w:val="1"/>
+        </w:numPr>
+      </w:pPr>
+      <w:r>
+        <w:t xml:space="preserve">Here is the chat that I used to figure out how to build that script: </w:t>
+      </w:r>
+      <w:hyperlink r:id="rId19" w:history="1">
+        <w:r>
+          <w:rPr>
+            <w:rStyle w:val="Hyperlink"/>
+          </w:rPr>
+          <w:t>here</w:t>
+        </w:r>
+      </w:hyperlink>
+    </w:p>
+    <w:p>
+      <w:pPr>
+        <w:pStyle w:val="ListParagraph"/>
+        <w:numPr>
+          <w:ilvl w:val="1"/>
+          <w:numId w:val="1"/>
+        </w:numPr>
+      </w:pPr>
+      <w:r>
+        <w:t>The links are found (as much as possible)</w:t>
+      </w:r>
+    </w:p>
+    <w:p>
+      <w:pPr>
+        <w:pStyle w:val="ListParagraph"/>
+        <w:numPr>
+          <w:ilvl w:val="0"/>
+          <w:numId w:val="1"/>
+        </w:numPr>
+      </w:pPr>
+      <w:r>
+        <w:t xml:space="preserve">Once that finishes, I will use whatever links </w:t>
+      </w:r>
+      <w:r>
+        <w:t xml:space="preserve">I have </w:t>
+      </w:r>
+      <w:r>
+        <w:t xml:space="preserve">to build the Programmable Search Engines </w:t>
+      </w:r>
+      <w:r>
+        <w:t xml:space="preserve">(probably one for each state/territory + one for the national newspapers) </w:t>
+      </w:r>
+      <w:r>
+        <w:t xml:space="preserve">and then run </w:t>
+      </w:r>
+      <w:r>
+        <w:t xml:space="preserve">the national search engine and relevant state search engine </w:t>
+      </w:r>
+      <w:r>
+        <w:t>on each climate disaster</w:t>
+      </w:r>
+      <w:r>
+        <w:t xml:space="preserve"> to find a ton of articles</w:t>
+      </w:r>
+    </w:p>
+    <w:p>
+      <w:pPr>
+        <w:rPr>
+          <w:b/>
+          <w:bCs/>
+        </w:rPr>
+      </w:pPr>
+      <w:r>
+        <w:rPr>
+          <w:b/>
+          <w:bCs/>
+        </w:rPr>
+        <w:t>Work on April 5</w:t>
+      </w:r>
+    </w:p>
+    <w:p>
+      <w:pPr>
+        <w:pStyle w:val="ListParagraph"/>
+        <w:numPr>
+          <w:ilvl w:val="0"/>
+          <w:numId w:val="1"/>
+        </w:numPr>
+      </w:pPr>
+      <w:r>
+        <w:t>I created 18 PSEs for about 900 newspaper website domains. I then created a script to find at most 10 articles per climate disaster and then output it to a spreadsheet.</w:t>
+      </w:r>
+    </w:p>
+    <w:p>
+      <w:pPr>
+        <w:pStyle w:val="ListParagraph"/>
+        <w:numPr>
+          <w:ilvl w:val="1"/>
+          <w:numId w:val="1"/>
+        </w:numPr>
+      </w:pPr>
+      <w:r>
+        <w:t xml:space="preserve">Here is the </w:t>
+      </w:r>
+      <w:r>
+        <w:t>chat that I used to build the script to do the Google searches</w:t>
+      </w:r>
+      <w:r>
+        <w:t xml:space="preserve">: </w:t>
+      </w:r>
+      <w:hyperlink r:id="rId20" w:history="1">
+        <w:r>
+          <w:rPr>
+            <w:rStyle w:val="Hyperlink"/>
+          </w:rPr>
+          <w:t>here</w:t>
+        </w:r>
+      </w:hyperlink>
+    </w:p>
+    <w:p>
+      <w:pPr>
+        <w:pStyle w:val="ListParagraph"/>
+        <w:numPr>
+          <w:ilvl w:val="0"/>
+          <w:numId w:val="1"/>
+        </w:numPr>
+      </w:pPr>
+      <w:r>
+        <w:t>After I have the URLs for so many articles, I can scrape the article texts and then run it in an LLM to develop some kind of climate disaster communication index</w:t>
       </w:r>
     </w:p>
     <w:sectPr>

</xml_diff>